<commit_message>
Record TaleFin answers; infer transfers across connected accounts
- Transactions available, 180-day pulls, AEST, per-lender figures from
  transactions only (Q12, Q17, Q18, Q19)
- TaleFin can't flag own-account transfers: match a debit and a
  same-amount credit on two connected accounts within 2 days; unmatched
  transfer-looking items are listed for the customer to confirm (Q20)
- Onboarding asks customers to connect every account they use
- Review doc and Word copy updated

Co-Authored-By: Claude Opus 5.5 <noreply@anthropic.com>
Claude-Session: https://claude.ai/code/session_01BQuG2bu4esL5kQobzopCwY
</commit_message>
<xml_diff>
--- a/docs/Tippla_TaleFin_Response_Review.docx
+++ b/docs/Tippla_TaleFin_Response_Review.docx
@@ -5592,108 +5592,867 @@
         <w:pStyle w:val="Heading1"/>
       </w:pPr>
       <w:r>
-        <w:t xml:space="preserve">Asks for TaleFin</w:t>
+        <w:t xml:space="preserve">Asks for TaleFin — answered 30/09/2026</w:t>
       </w:r>
     </w:p>
+    <w:tbl>
+      <w:tblPr>
+        <w:tblW w:type="dxa" w:w="9638"/>
+        <w:tblBorders>
+          <w:top w:val="single" w:color="auto" w:sz="4"/>
+          <w:left w:val="single" w:color="auto" w:sz="4"/>
+          <w:bottom w:val="single" w:color="auto" w:sz="4"/>
+          <w:right w:val="single" w:color="auto" w:sz="4"/>
+          <w:insideH w:val="single" w:color="auto" w:sz="4"/>
+          <w:insideV w:val="single" w:color="auto" w:sz="4"/>
+        </w:tblBorders>
+      </w:tblPr>
+      <w:tblGrid>
+        <w:gridCol w:w="826"/>
+        <w:gridCol w:w="826"/>
+        <w:gridCol w:w="1305"/>
+        <w:gridCol w:w="6681"/>
+      </w:tblGrid>
+      <w:tr>
+        <w:trPr>
+          <w:tblHeader/>
+        </w:trPr>
+        <w:tc>
+          <w:tcPr>
+            <w:tcW w:type="dxa" w:w="826"/>
+            <w:tcBorders>
+              <w:top w:val="single" w:color="D6D0E8" w:sz="4"/>
+              <w:left w:val="single" w:color="D6D0E8" w:sz="4"/>
+              <w:bottom w:val="single" w:color="D6D0E8" w:sz="4"/>
+              <w:right w:val="single" w:color="D6D0E8" w:sz="4"/>
+            </w:tcBorders>
+            <w:shd w:fill="ECE8FB" w:color="auto" w:val="clear"/>
+            <w:tcMar>
+              <w:top w:type="dxa" w:w="60"/>
+              <w:left w:type="dxa" w:w="100"/>
+              <w:bottom w:type="dxa" w:w="60"/>
+              <w:right w:type="dxa" w:w="100"/>
+            </w:tcMar>
+          </w:tcPr>
+          <w:p>
+            <w:r>
+              <w:rPr>
+                <w:b/>
+                <w:bCs/>
+                <w:sz w:val="18"/>
+                <w:szCs w:val="18"/>
+              </w:rPr>
+              <w:t xml:space="preserve">#</w:t>
+            </w:r>
+          </w:p>
+        </w:tc>
+        <w:tc>
+          <w:tcPr>
+            <w:tcW w:type="dxa" w:w="826"/>
+            <w:tcBorders>
+              <w:top w:val="single" w:color="D6D0E8" w:sz="4"/>
+              <w:left w:val="single" w:color="D6D0E8" w:sz="4"/>
+              <w:bottom w:val="single" w:color="D6D0E8" w:sz="4"/>
+              <w:right w:val="single" w:color="D6D0E8" w:sz="4"/>
+            </w:tcBorders>
+            <w:shd w:fill="ECE8FB" w:color="auto" w:val="clear"/>
+            <w:tcMar>
+              <w:top w:type="dxa" w:w="60"/>
+              <w:left w:type="dxa" w:w="100"/>
+              <w:bottom w:type="dxa" w:w="60"/>
+              <w:right w:type="dxa" w:w="100"/>
+            </w:tcMar>
+          </w:tcPr>
+          <w:p>
+            <w:r>
+              <w:rPr>
+                <w:b/>
+                <w:bCs/>
+                <w:sz w:val="18"/>
+                <w:szCs w:val="18"/>
+              </w:rPr>
+              <w:t xml:space="preserve">Ask</w:t>
+            </w:r>
+          </w:p>
+        </w:tc>
+        <w:tc>
+          <w:tcPr>
+            <w:tcW w:type="dxa" w:w="1305"/>
+            <w:tcBorders>
+              <w:top w:val="single" w:color="D6D0E8" w:sz="4"/>
+              <w:left w:val="single" w:color="D6D0E8" w:sz="4"/>
+              <w:bottom w:val="single" w:color="D6D0E8" w:sz="4"/>
+              <w:right w:val="single" w:color="D6D0E8" w:sz="4"/>
+            </w:tcBorders>
+            <w:shd w:fill="ECE8FB" w:color="auto" w:val="clear"/>
+            <w:tcMar>
+              <w:top w:type="dxa" w:w="60"/>
+              <w:left w:type="dxa" w:w="100"/>
+              <w:bottom w:type="dxa" w:w="60"/>
+              <w:right w:type="dxa" w:w="100"/>
+            </w:tcMar>
+          </w:tcPr>
+          <w:p>
+            <w:r>
+              <w:rPr>
+                <w:b/>
+                <w:bCs/>
+                <w:sz w:val="18"/>
+                <w:szCs w:val="18"/>
+              </w:rPr>
+              <w:t xml:space="preserve">Answer</w:t>
+            </w:r>
+          </w:p>
+        </w:tc>
+        <w:tc>
+          <w:tcPr>
+            <w:tcW w:type="dxa" w:w="6681"/>
+            <w:tcBorders>
+              <w:top w:val="single" w:color="D6D0E8" w:sz="4"/>
+              <w:left w:val="single" w:color="D6D0E8" w:sz="4"/>
+              <w:bottom w:val="single" w:color="D6D0E8" w:sz="4"/>
+              <w:right w:val="single" w:color="D6D0E8" w:sz="4"/>
+            </w:tcBorders>
+            <w:shd w:fill="ECE8FB" w:color="auto" w:val="clear"/>
+            <w:tcMar>
+              <w:top w:type="dxa" w:w="60"/>
+              <w:left w:type="dxa" w:w="100"/>
+              <w:bottom w:type="dxa" w:w="60"/>
+              <w:right w:type="dxa" w:w="100"/>
+            </w:tcMar>
+          </w:tcPr>
+          <w:p>
+            <w:r>
+              <w:rPr>
+                <w:b/>
+                <w:bCs/>
+                <w:sz w:val="18"/>
+                <w:szCs w:val="18"/>
+              </w:rPr>
+              <w:t xml:space="preserve">What it means for the build</w:t>
+            </w:r>
+          </w:p>
+        </w:tc>
+      </w:tr>
+      <w:tr>
+        <w:trPr>
+          <w:tblHeader w:val="off"/>
+        </w:trPr>
+        <w:tc>
+          <w:tcPr>
+            <w:tcW w:type="dxa" w:w="826"/>
+            <w:tcBorders>
+              <w:top w:val="single" w:color="D6D0E8" w:sz="4"/>
+              <w:left w:val="single" w:color="D6D0E8" w:sz="4"/>
+              <w:bottom w:val="single" w:color="D6D0E8" w:sz="4"/>
+              <w:right w:val="single" w:color="D6D0E8" w:sz="4"/>
+            </w:tcBorders>
+            <w:tcMar>
+              <w:top w:type="dxa" w:w="60"/>
+              <w:left w:type="dxa" w:w="100"/>
+              <w:bottom w:type="dxa" w:w="60"/>
+              <w:right w:type="dxa" w:w="100"/>
+            </w:tcMar>
+          </w:tcPr>
+          <w:p>
+            <w:r>
+              <w:rPr>
+                <w:sz w:val="18"/>
+                <w:szCs w:val="18"/>
+              </w:rPr>
+              <w:t xml:space="preserve">1</w:t>
+            </w:r>
+          </w:p>
+        </w:tc>
+        <w:tc>
+          <w:tcPr>
+            <w:tcW w:type="dxa" w:w="826"/>
+            <w:tcBorders>
+              <w:top w:val="single" w:color="D6D0E8" w:sz="4"/>
+              <w:left w:val="single" w:color="D6D0E8" w:sz="4"/>
+              <w:bottom w:val="single" w:color="D6D0E8" w:sz="4"/>
+              <w:right w:val="single" w:color="D6D0E8" w:sz="4"/>
+            </w:tcBorders>
+            <w:tcMar>
+              <w:top w:type="dxa" w:w="60"/>
+              <w:left w:type="dxa" w:w="100"/>
+              <w:bottom w:type="dxa" w:w="60"/>
+              <w:right w:type="dxa" w:w="100"/>
+            </w:tcMar>
+          </w:tcPr>
+          <w:p>
+            <w:r>
+              <w:rPr>
+                <w:sz w:val="18"/>
+                <w:szCs w:val="18"/>
+              </w:rPr>
+              <w:t xml:space="preserve">Transaction-level data</w:t>
+            </w:r>
+          </w:p>
+        </w:tc>
+        <w:tc>
+          <w:tcPr>
+            <w:tcW w:type="dxa" w:w="1305"/>
+            <w:tcBorders>
+              <w:top w:val="single" w:color="D6D0E8" w:sz="4"/>
+              <w:left w:val="single" w:color="D6D0E8" w:sz="4"/>
+              <w:bottom w:val="single" w:color="D6D0E8" w:sz="4"/>
+              <w:right w:val="single" w:color="D6D0E8" w:sz="4"/>
+            </w:tcBorders>
+            <w:tcMar>
+              <w:top w:type="dxa" w:w="60"/>
+              <w:left w:type="dxa" w:w="100"/>
+              <w:bottom w:type="dxa" w:w="60"/>
+              <w:right w:type="dxa" w:w="100"/>
+            </w:tcMar>
+          </w:tcPr>
+          <w:p>
+            <w:r>
+              <w:rPr>
+                <w:sz w:val="18"/>
+                <w:szCs w:val="18"/>
+              </w:rPr>
+              <w:t xml:space="preserve">Yes, transactions can be extracted</w:t>
+            </w:r>
+          </w:p>
+        </w:tc>
+        <w:tc>
+          <w:tcPr>
+            <w:tcW w:type="dxa" w:w="6681"/>
+            <w:tcBorders>
+              <w:top w:val="single" w:color="D6D0E8" w:sz="4"/>
+              <w:left w:val="single" w:color="D6D0E8" w:sz="4"/>
+              <w:bottom w:val="single" w:color="D6D0E8" w:sz="4"/>
+              <w:right w:val="single" w:color="D6D0E8" w:sz="4"/>
+            </w:tcBorders>
+            <w:tcMar>
+              <w:top w:type="dxa" w:w="60"/>
+              <w:left w:type="dxa" w:w="100"/>
+              <w:bottom w:type="dxa" w:w="60"/>
+              <w:right w:type="dxa" w:w="100"/>
+            </w:tcMar>
+          </w:tcPr>
+          <w:p>
+            <w:r>
+              <w:rPr>
+                <w:sz w:val="18"/>
+                <w:szCs w:val="18"/>
+              </w:rPr>
+              <w:t xml:space="preserve">The Spending screen works as designed: per-pay-cycle categories, merchants, recategorising and search, all from transactions. </w:t>
+            </w:r>
+            <w:r>
+              <w:rPr>
+                <w:rFonts w:ascii="Consolas" w:cs="Consolas" w:eastAsia="Consolas" w:hAnsi="Consolas"/>
+                <w:sz w:val="18"/>
+                <w:szCs w:val="18"/>
+              </w:rPr>
+              <w:t xml:space="preserve">transactions.json</w:t>
+            </w:r>
+            <w:r>
+              <w:rPr>
+                <w:sz w:val="18"/>
+                <w:szCs w:val="18"/>
+              </w:rPr>
+              <w:t xml:space="preserve"> is the model of that feed</w:t>
+            </w:r>
+          </w:p>
+        </w:tc>
+      </w:tr>
+      <w:tr>
+        <w:trPr>
+          <w:tblHeader w:val="off"/>
+        </w:trPr>
+        <w:tc>
+          <w:tcPr>
+            <w:tcW w:type="dxa" w:w="826"/>
+            <w:tcBorders>
+              <w:top w:val="single" w:color="D6D0E8" w:sz="4"/>
+              <w:left w:val="single" w:color="D6D0E8" w:sz="4"/>
+              <w:bottom w:val="single" w:color="D6D0E8" w:sz="4"/>
+              <w:right w:val="single" w:color="D6D0E8" w:sz="4"/>
+            </w:tcBorders>
+            <w:tcMar>
+              <w:top w:type="dxa" w:w="60"/>
+              <w:left w:type="dxa" w:w="100"/>
+              <w:bottom w:type="dxa" w:w="60"/>
+              <w:right w:type="dxa" w:w="100"/>
+            </w:tcMar>
+          </w:tcPr>
+          <w:p>
+            <w:r>
+              <w:rPr>
+                <w:sz w:val="18"/>
+                <w:szCs w:val="18"/>
+              </w:rPr>
+              <w:t xml:space="preserve">2</w:t>
+            </w:r>
+          </w:p>
+        </w:tc>
+        <w:tc>
+          <w:tcPr>
+            <w:tcW w:type="dxa" w:w="826"/>
+            <w:tcBorders>
+              <w:top w:val="single" w:color="D6D0E8" w:sz="4"/>
+              <w:left w:val="single" w:color="D6D0E8" w:sz="4"/>
+              <w:bottom w:val="single" w:color="D6D0E8" w:sz="4"/>
+              <w:right w:val="single" w:color="D6D0E8" w:sz="4"/>
+            </w:tcBorders>
+            <w:tcMar>
+              <w:top w:type="dxa" w:w="60"/>
+              <w:left w:type="dxa" w:w="100"/>
+              <w:bottom w:type="dxa" w:w="60"/>
+              <w:right w:type="dxa" w:w="100"/>
+            </w:tcMar>
+          </w:tcPr>
+          <w:p>
+            <w:r>
+              <w:rPr>
+                <w:sz w:val="18"/>
+                <w:szCs w:val="18"/>
+              </w:rPr>
+              <w:t xml:space="preserve">180-day pull</w:t>
+            </w:r>
+          </w:p>
+        </w:tc>
+        <w:tc>
+          <w:tcPr>
+            <w:tcW w:type="dxa" w:w="1305"/>
+            <w:tcBorders>
+              <w:top w:val="single" w:color="D6D0E8" w:sz="4"/>
+              <w:left w:val="single" w:color="D6D0E8" w:sz="4"/>
+              <w:bottom w:val="single" w:color="D6D0E8" w:sz="4"/>
+              <w:right w:val="single" w:color="D6D0E8" w:sz="4"/>
+            </w:tcBorders>
+            <w:tcMar>
+              <w:top w:type="dxa" w:w="60"/>
+              <w:left w:type="dxa" w:w="100"/>
+              <w:bottom w:type="dxa" w:w="60"/>
+              <w:right w:type="dxa" w:w="100"/>
+            </w:tcMar>
+          </w:tcPr>
+          <w:p>
+            <w:r>
+              <w:rPr>
+                <w:sz w:val="18"/>
+                <w:szCs w:val="18"/>
+              </w:rPr>
+              <w:t xml:space="preserve">Yes, 180 days</w:t>
+            </w:r>
+          </w:p>
+        </w:tc>
+        <w:tc>
+          <w:tcPr>
+            <w:tcW w:type="dxa" w:w="6681"/>
+            <w:tcBorders>
+              <w:top w:val="single" w:color="D6D0E8" w:sz="4"/>
+              <w:left w:val="single" w:color="D6D0E8" w:sz="4"/>
+              <w:bottom w:val="single" w:color="D6D0E8" w:sz="4"/>
+              <w:right w:val="single" w:color="D6D0E8" w:sz="4"/>
+            </w:tcBorders>
+            <w:tcMar>
+              <w:top w:type="dxa" w:w="60"/>
+              <w:left w:type="dxa" w:w="100"/>
+              <w:bottom w:type="dxa" w:w="60"/>
+              <w:right w:type="dxa" w:w="100"/>
+            </w:tcMar>
+          </w:tcPr>
+          <w:p>
+            <w:r>
+              <w:rPr>
+                <w:sz w:val="18"/>
+                <w:szCs w:val="18"/>
+              </w:rPr>
+              <w:t xml:space="preserve">The six-month chart stays; the mock already holds 180 days</w:t>
+            </w:r>
+          </w:p>
+        </w:tc>
+      </w:tr>
+      <w:tr>
+        <w:trPr>
+          <w:tblHeader w:val="off"/>
+        </w:trPr>
+        <w:tc>
+          <w:tcPr>
+            <w:tcW w:type="dxa" w:w="826"/>
+            <w:tcBorders>
+              <w:top w:val="single" w:color="D6D0E8" w:sz="4"/>
+              <w:left w:val="single" w:color="D6D0E8" w:sz="4"/>
+              <w:bottom w:val="single" w:color="D6D0E8" w:sz="4"/>
+              <w:right w:val="single" w:color="D6D0E8" w:sz="4"/>
+            </w:tcBorders>
+            <w:tcMar>
+              <w:top w:type="dxa" w:w="60"/>
+              <w:left w:type="dxa" w:w="100"/>
+              <w:bottom w:type="dxa" w:w="60"/>
+              <w:right w:type="dxa" w:w="100"/>
+            </w:tcMar>
+          </w:tcPr>
+          <w:p>
+            <w:r>
+              <w:rPr>
+                <w:sz w:val="18"/>
+                <w:szCs w:val="18"/>
+              </w:rPr>
+              <w:t xml:space="preserve">3</w:t>
+            </w:r>
+          </w:p>
+        </w:tc>
+        <w:tc>
+          <w:tcPr>
+            <w:tcW w:type="dxa" w:w="826"/>
+            <w:tcBorders>
+              <w:top w:val="single" w:color="D6D0E8" w:sz="4"/>
+              <w:left w:val="single" w:color="D6D0E8" w:sz="4"/>
+              <w:bottom w:val="single" w:color="D6D0E8" w:sz="4"/>
+              <w:right w:val="single" w:color="D6D0E8" w:sz="4"/>
+            </w:tcBorders>
+            <w:tcMar>
+              <w:top w:type="dxa" w:w="60"/>
+              <w:left w:type="dxa" w:w="100"/>
+              <w:bottom w:type="dxa" w:w="60"/>
+              <w:right w:type="dxa" w:w="100"/>
+            </w:tcMar>
+          </w:tcPr>
+          <w:p>
+            <w:r>
+              <w:rPr>
+                <w:sz w:val="18"/>
+                <w:szCs w:val="18"/>
+              </w:rPr>
+              <w:t xml:space="preserve">Flagging transfers between own accounts</w:t>
+            </w:r>
+          </w:p>
+        </w:tc>
+        <w:tc>
+          <w:tcPr>
+            <w:tcW w:type="dxa" w:w="1305"/>
+            <w:tcBorders>
+              <w:top w:val="single" w:color="D6D0E8" w:sz="4"/>
+              <w:left w:val="single" w:color="D6D0E8" w:sz="4"/>
+              <w:bottom w:val="single" w:color="D6D0E8" w:sz="4"/>
+              <w:right w:val="single" w:color="D6D0E8" w:sz="4"/>
+            </w:tcBorders>
+            <w:tcMar>
+              <w:top w:type="dxa" w:w="60"/>
+              <w:left w:type="dxa" w:w="100"/>
+              <w:bottom w:type="dxa" w:w="60"/>
+              <w:right w:type="dxa" w:w="100"/>
+            </w:tcMar>
+          </w:tcPr>
+          <w:p>
+            <w:r>
+              <w:rPr>
+                <w:sz w:val="18"/>
+                <w:szCs w:val="18"/>
+              </w:rPr>
+              <w:t xml:space="preserve">Not conclusively.</w:t>
+            </w:r>
+            <w:r>
+              <w:rPr>
+                <w:sz w:val="18"/>
+                <w:szCs w:val="18"/>
+              </w:rPr>
+              <w:t xml:space="preserve"> The customer can connect more than one account</w:t>
+            </w:r>
+          </w:p>
+        </w:tc>
+        <w:tc>
+          <w:tcPr>
+            <w:tcW w:type="dxa" w:w="6681"/>
+            <w:tcBorders>
+              <w:top w:val="single" w:color="D6D0E8" w:sz="4"/>
+              <w:left w:val="single" w:color="D6D0E8" w:sz="4"/>
+              <w:bottom w:val="single" w:color="D6D0E8" w:sz="4"/>
+              <w:right w:val="single" w:color="D6D0E8" w:sz="4"/>
+            </w:tcBorders>
+            <w:tcMar>
+              <w:top w:type="dxa" w:w="60"/>
+              <w:left w:type="dxa" w:w="100"/>
+              <w:bottom w:type="dxa" w:w="60"/>
+              <w:right w:type="dxa" w:w="100"/>
+            </w:tcMar>
+          </w:tcPr>
+          <w:p>
+            <w:r>
+              <w:rPr>
+                <w:sz w:val="18"/>
+                <w:szCs w:val="18"/>
+              </w:rPr>
+              <w:t xml:space="preserve">Tippla infers them: a debit on one connected account and the same amount credited to another within 2 days is a transfer and leaves every total (</w:t>
+            </w:r>
+            <w:r>
+              <w:rPr>
+                <w:rFonts w:ascii="Consolas" w:cs="Consolas" w:eastAsia="Consolas" w:hAnsi="Consolas"/>
+                <w:sz w:val="18"/>
+                <w:szCs w:val="18"/>
+              </w:rPr>
+              <w:t xml:space="preserve">findTransferPairs</w:t>
+            </w:r>
+            <w:r>
+              <w:rPr>
+                <w:sz w:val="18"/>
+                <w:szCs w:val="18"/>
+              </w:rPr>
+              <w:t xml:space="preserve">). Onboarding (O3) should ask the customer to connect every account they use. Transfer-looking items with no match are listed for the customer to confirm, rather than silently excluded</w:t>
+            </w:r>
+          </w:p>
+        </w:tc>
+      </w:tr>
+      <w:tr>
+        <w:trPr>
+          <w:tblHeader w:val="off"/>
+        </w:trPr>
+        <w:tc>
+          <w:tcPr>
+            <w:tcW w:type="dxa" w:w="826"/>
+            <w:tcBorders>
+              <w:top w:val="single" w:color="D6D0E8" w:sz="4"/>
+              <w:left w:val="single" w:color="D6D0E8" w:sz="4"/>
+              <w:bottom w:val="single" w:color="D6D0E8" w:sz="4"/>
+              <w:right w:val="single" w:color="D6D0E8" w:sz="4"/>
+            </w:tcBorders>
+            <w:tcMar>
+              <w:top w:type="dxa" w:w="60"/>
+              <w:left w:type="dxa" w:w="100"/>
+              <w:bottom w:type="dxa" w:w="60"/>
+              <w:right w:type="dxa" w:w="100"/>
+            </w:tcMar>
+          </w:tcPr>
+          <w:p>
+            <w:r>
+              <w:rPr>
+                <w:sz w:val="18"/>
+                <w:szCs w:val="18"/>
+              </w:rPr>
+              <w:t xml:space="preserve">4</w:t>
+            </w:r>
+          </w:p>
+        </w:tc>
+        <w:tc>
+          <w:tcPr>
+            <w:tcW w:type="dxa" w:w="826"/>
+            <w:tcBorders>
+              <w:top w:val="single" w:color="D6D0E8" w:sz="4"/>
+              <w:left w:val="single" w:color="D6D0E8" w:sz="4"/>
+              <w:bottom w:val="single" w:color="D6D0E8" w:sz="4"/>
+              <w:right w:val="single" w:color="D6D0E8" w:sz="4"/>
+            </w:tcBorders>
+            <w:tcMar>
+              <w:top w:type="dxa" w:w="60"/>
+              <w:left w:type="dxa" w:w="100"/>
+              <w:bottom w:type="dxa" w:w="60"/>
+              <w:right w:type="dxa" w:w="100"/>
+            </w:tcMar>
+          </w:tcPr>
+          <w:p>
+            <w:r>
+              <w:rPr>
+                <w:sz w:val="18"/>
+                <w:szCs w:val="18"/>
+              </w:rPr>
+              <w:t xml:space="preserve">Per-lender balances and repayments</w:t>
+            </w:r>
+          </w:p>
+        </w:tc>
+        <w:tc>
+          <w:tcPr>
+            <w:tcW w:type="dxa" w:w="1305"/>
+            <w:tcBorders>
+              <w:top w:val="single" w:color="D6D0E8" w:sz="4"/>
+              <w:left w:val="single" w:color="D6D0E8" w:sz="4"/>
+              <w:bottom w:val="single" w:color="D6D0E8" w:sz="4"/>
+              <w:right w:val="single" w:color="D6D0E8" w:sz="4"/>
+            </w:tcBorders>
+            <w:tcMar>
+              <w:top w:type="dxa" w:w="60"/>
+              <w:left w:type="dxa" w:w="100"/>
+              <w:bottom w:type="dxa" w:w="60"/>
+              <w:right w:type="dxa" w:w="100"/>
+            </w:tcMar>
+          </w:tcPr>
+          <w:p>
+            <w:r>
+              <w:rPr>
+                <w:sz w:val="18"/>
+                <w:szCs w:val="18"/>
+              </w:rPr>
+              <w:t xml:space="preserve">From transactions only</w:t>
+            </w:r>
+          </w:p>
+        </w:tc>
+        <w:tc>
+          <w:tcPr>
+            <w:tcW w:type="dxa" w:w="6681"/>
+            <w:tcBorders>
+              <w:top w:val="single" w:color="D6D0E8" w:sz="4"/>
+              <w:left w:val="single" w:color="D6D0E8" w:sz="4"/>
+              <w:bottom w:val="single" w:color="D6D0E8" w:sz="4"/>
+              <w:right w:val="single" w:color="D6D0E8" w:sz="4"/>
+            </w:tcBorders>
+            <w:tcMar>
+              <w:top w:type="dxa" w:w="60"/>
+              <w:left w:type="dxa" w:w="100"/>
+              <w:bottom w:type="dxa" w:w="60"/>
+              <w:right w:type="dxa" w:w="100"/>
+            </w:tcMar>
+          </w:tcPr>
+          <w:p>
+            <w:r>
+              <w:rPr>
+                <w:sz w:val="18"/>
+                <w:szCs w:val="18"/>
+              </w:rPr>
+              <w:t xml:space="preserve">Per-lender repayments, dishonours and "borrowed / repaid so far" come from transactions (</w:t>
+            </w:r>
+            <w:r>
+              <w:rPr>
+                <w:rFonts w:ascii="Consolas" w:cs="Consolas" w:eastAsia="Consolas" w:hAnsi="Consolas"/>
+                <w:sz w:val="18"/>
+                <w:szCs w:val="18"/>
+              </w:rPr>
+              <w:t xml:space="preserve">activeLoans()[].activity</w:t>
+            </w:r>
+            <w:r>
+              <w:rPr>
+                <w:sz w:val="18"/>
+                <w:szCs w:val="18"/>
+              </w:rPr>
+              <w:t xml:space="preserve">). TaleFin's class totals are the cross-check. Balances stay labelled "estimated"</w:t>
+            </w:r>
+          </w:p>
+        </w:tc>
+      </w:tr>
+      <w:tr>
+        <w:trPr>
+          <w:tblHeader w:val="off"/>
+        </w:trPr>
+        <w:tc>
+          <w:tcPr>
+            <w:tcW w:type="dxa" w:w="826"/>
+            <w:tcBorders>
+              <w:top w:val="single" w:color="D6D0E8" w:sz="4"/>
+              <w:left w:val="single" w:color="D6D0E8" w:sz="4"/>
+              <w:bottom w:val="single" w:color="D6D0E8" w:sz="4"/>
+              <w:right w:val="single" w:color="D6D0E8" w:sz="4"/>
+            </w:tcBorders>
+            <w:tcMar>
+              <w:top w:type="dxa" w:w="60"/>
+              <w:left w:type="dxa" w:w="100"/>
+              <w:bottom w:type="dxa" w:w="60"/>
+              <w:right w:type="dxa" w:w="100"/>
+            </w:tcMar>
+          </w:tcPr>
+          <w:p>
+            <w:r>
+              <w:rPr>
+                <w:sz w:val="18"/>
+                <w:szCs w:val="18"/>
+              </w:rPr>
+              <w:t xml:space="preserve">5</w:t>
+            </w:r>
+          </w:p>
+        </w:tc>
+        <w:tc>
+          <w:tcPr>
+            <w:tcW w:type="dxa" w:w="826"/>
+            <w:tcBorders>
+              <w:top w:val="single" w:color="D6D0E8" w:sz="4"/>
+              <w:left w:val="single" w:color="D6D0E8" w:sz="4"/>
+              <w:bottom w:val="single" w:color="D6D0E8" w:sz="4"/>
+              <w:right w:val="single" w:color="D6D0E8" w:sz="4"/>
+            </w:tcBorders>
+            <w:tcMar>
+              <w:top w:type="dxa" w:w="60"/>
+              <w:left w:type="dxa" w:w="100"/>
+              <w:bottom w:type="dxa" w:w="60"/>
+              <w:right w:type="dxa" w:w="100"/>
+            </w:tcMar>
+          </w:tcPr>
+          <w:p>
+            <w:r>
+              <w:rPr>
+                <w:rFonts w:ascii="Consolas" w:cs="Consolas" w:eastAsia="Consolas" w:hAnsi="Consolas"/>
+                <w:sz w:val="18"/>
+                <w:szCs w:val="18"/>
+              </w:rPr>
+              <w:t xml:space="preserve">SCORED_DATETIME</w:t>
+            </w:r>
+            <w:r>
+              <w:rPr>
+                <w:sz w:val="18"/>
+                <w:szCs w:val="18"/>
+              </w:rPr>
+              <w:t xml:space="preserve"> timezone</w:t>
+            </w:r>
+          </w:p>
+        </w:tc>
+        <w:tc>
+          <w:tcPr>
+            <w:tcW w:type="dxa" w:w="1305"/>
+            <w:tcBorders>
+              <w:top w:val="single" w:color="D6D0E8" w:sz="4"/>
+              <w:left w:val="single" w:color="D6D0E8" w:sz="4"/>
+              <w:bottom w:val="single" w:color="D6D0E8" w:sz="4"/>
+              <w:right w:val="single" w:color="D6D0E8" w:sz="4"/>
+            </w:tcBorders>
+            <w:tcMar>
+              <w:top w:type="dxa" w:w="60"/>
+              <w:left w:type="dxa" w:w="100"/>
+              <w:bottom w:type="dxa" w:w="60"/>
+              <w:right w:type="dxa" w:w="100"/>
+            </w:tcMar>
+          </w:tcPr>
+          <w:p>
+            <w:r>
+              <w:rPr>
+                <w:sz w:val="18"/>
+                <w:szCs w:val="18"/>
+              </w:rPr>
+              <w:t xml:space="preserve">AEST</w:t>
+            </w:r>
+          </w:p>
+        </w:tc>
+        <w:tc>
+          <w:tcPr>
+            <w:tcW w:type="dxa" w:w="6681"/>
+            <w:tcBorders>
+              <w:top w:val="single" w:color="D6D0E8" w:sz="4"/>
+              <w:left w:val="single" w:color="D6D0E8" w:sz="4"/>
+              <w:bottom w:val="single" w:color="D6D0E8" w:sz="4"/>
+              <w:right w:val="single" w:color="D6D0E8" w:sz="4"/>
+            </w:tcBorders>
+            <w:tcMar>
+              <w:top w:type="dxa" w:w="60"/>
+              <w:left w:type="dxa" w:w="100"/>
+              <w:bottom w:type="dxa" w:w="60"/>
+              <w:right w:type="dxa" w:w="100"/>
+            </w:tcMar>
+          </w:tcPr>
+          <w:p>
+            <w:r>
+              <w:rPr>
+                <w:sz w:val="18"/>
+                <w:szCs w:val="18"/>
+              </w:rPr>
+              <w:t xml:space="preserve">Already handled</w:t>
+            </w:r>
+          </w:p>
+        </w:tc>
+      </w:tr>
+      <w:tr>
+        <w:trPr>
+          <w:tblHeader w:val="off"/>
+        </w:trPr>
+        <w:tc>
+          <w:tcPr>
+            <w:tcW w:type="dxa" w:w="826"/>
+            <w:tcBorders>
+              <w:top w:val="single" w:color="D6D0E8" w:sz="4"/>
+              <w:left w:val="single" w:color="D6D0E8" w:sz="4"/>
+              <w:bottom w:val="single" w:color="D6D0E8" w:sz="4"/>
+              <w:right w:val="single" w:color="D6D0E8" w:sz="4"/>
+            </w:tcBorders>
+            <w:tcMar>
+              <w:top w:type="dxa" w:w="60"/>
+              <w:left w:type="dxa" w:w="100"/>
+              <w:bottom w:type="dxa" w:w="60"/>
+              <w:right w:type="dxa" w:w="100"/>
+            </w:tcMar>
+          </w:tcPr>
+          <w:p>
+            <w:r>
+              <w:rPr>
+                <w:sz w:val="18"/>
+                <w:szCs w:val="18"/>
+              </w:rPr>
+              <w:t xml:space="preserve">6</w:t>
+            </w:r>
+          </w:p>
+        </w:tc>
+        <w:tc>
+          <w:tcPr>
+            <w:tcW w:type="dxa" w:w="826"/>
+            <w:tcBorders>
+              <w:top w:val="single" w:color="D6D0E8" w:sz="4"/>
+              <w:left w:val="single" w:color="D6D0E8" w:sz="4"/>
+              <w:bottom w:val="single" w:color="D6D0E8" w:sz="4"/>
+              <w:right w:val="single" w:color="D6D0E8" w:sz="4"/>
+            </w:tcBorders>
+            <w:tcMar>
+              <w:top w:type="dxa" w:w="60"/>
+              <w:left w:type="dxa" w:w="100"/>
+              <w:bottom w:type="dxa" w:w="60"/>
+              <w:right w:type="dxa" w:w="100"/>
+            </w:tcMar>
+          </w:tcPr>
+          <w:p>
+            <w:r>
+              <w:rPr>
+                <w:sz w:val="18"/>
+                <w:szCs w:val="18"/>
+              </w:rPr>
+              <w:t xml:space="preserve">When AM2117/AM2120/AM2123 are populated</w:t>
+            </w:r>
+          </w:p>
+        </w:tc>
+        <w:tc>
+          <w:tcPr>
+            <w:tcW w:type="dxa" w:w="1305"/>
+            <w:tcBorders>
+              <w:top w:val="single" w:color="D6D0E8" w:sz="4"/>
+              <w:left w:val="single" w:color="D6D0E8" w:sz="4"/>
+              <w:bottom w:val="single" w:color="D6D0E8" w:sz="4"/>
+              <w:right w:val="single" w:color="D6D0E8" w:sz="4"/>
+            </w:tcBorders>
+            <w:tcMar>
+              <w:top w:type="dxa" w:w="60"/>
+              <w:left w:type="dxa" w:w="100"/>
+              <w:bottom w:type="dxa" w:w="60"/>
+              <w:right w:type="dxa" w:w="100"/>
+            </w:tcMar>
+          </w:tcPr>
+          <w:p>
+            <w:r>
+              <w:rPr>
+                <w:sz w:val="18"/>
+                <w:szCs w:val="18"/>
+              </w:rPr>
+              <w:t xml:space="preserve">Open, low priority</w:t>
+            </w:r>
+          </w:p>
+        </w:tc>
+        <w:tc>
+          <w:tcPr>
+            <w:tcW w:type="dxa" w:w="6681"/>
+            <w:tcBorders>
+              <w:top w:val="single" w:color="D6D0E8" w:sz="4"/>
+              <w:left w:val="single" w:color="D6D0E8" w:sz="4"/>
+              <w:bottom w:val="single" w:color="D6D0E8" w:sz="4"/>
+              <w:right w:val="single" w:color="D6D0E8" w:sz="4"/>
+            </w:tcBorders>
+            <w:tcMar>
+              <w:top w:type="dxa" w:w="60"/>
+              <w:left w:type="dxa" w:w="100"/>
+              <w:bottom w:type="dxa" w:w="60"/>
+              <w:right w:type="dxa" w:w="100"/>
+            </w:tcMar>
+          </w:tcPr>
+          <w:p>
+            <w:r>
+              <w:rPr>
+                <w:sz w:val="18"/>
+                <w:szCs w:val="18"/>
+              </w:rPr>
+              <w:t xml:space="preserve">Lender names already come from the other lists; this only confirms an assumption</w:t>
+            </w:r>
+          </w:p>
+        </w:tc>
+      </w:tr>
+    </w:tbl>
     <w:p>
       <w:pPr>
-        <w:pStyle w:val="ListParagraph"/>
-        <w:numPr>
-          <w:ilvl w:val="0"/>
-          <w:numId w:val="2"/>
-        </w:numPr>
-        <w:spacing w:after="80"/>
-      </w:pPr>
-      <w:r>
-        <w:t xml:space="preserve">The transaction-level endpoint (date, description, amount, category id, account, pending flag) and whether it's billed separately (Q18).</w:t>
-      </w:r>
-    </w:p>
-    <w:p>
-      <w:pPr>
-        <w:pStyle w:val="ListParagraph"/>
-        <w:numPr>
-          <w:ilvl w:val="0"/>
-          <w:numId w:val="2"/>
-        </w:numPr>
-        <w:spacing w:after="80"/>
-      </w:pPr>
-      <w:r>
-        <w:t xml:space="preserve">A 180-day (or longer) pull: cost and consent implications (Q17).</w:t>
-      </w:r>
-    </w:p>
-    <w:p>
-      <w:pPr>
-        <w:pStyle w:val="ListParagraph"/>
-        <w:numPr>
-          <w:ilvl w:val="0"/>
-          <w:numId w:val="2"/>
-        </w:numPr>
-        <w:spacing w:after="80"/>
-      </w:pPr>
-      <w:r>
-        <w:t xml:space="preserve">How much real spending lands in "Other Debit" (140), and whether transfers between the customer's own accounts can be flagged on transactions.</w:t>
-      </w:r>
-    </w:p>
-    <w:p>
-      <w:pPr>
-        <w:pStyle w:val="ListParagraph"/>
-        <w:numPr>
-          <w:ilvl w:val="0"/>
-          <w:numId w:val="2"/>
-        </w:numPr>
-        <w:spacing w:after="80"/>
-      </w:pPr>
-      <w:r>
-        <w:t xml:space="preserve">Per-lender balance and repayment figures, or confirmation that transactions are the only route.</w:t>
-      </w:r>
-    </w:p>
-    <w:p>
-      <w:pPr>
-        <w:pStyle w:val="ListParagraph"/>
-        <w:numPr>
-          <w:ilvl w:val="0"/>
-          <w:numId w:val="2"/>
-        </w:numPr>
-        <w:spacing w:after="80"/>
-      </w:pPr>
-      <w:r>
-        <w:t xml:space="preserve">Whether </w:t>
-      </w:r>
-      <w:r>
-        <w:rPr>
-          <w:rFonts w:ascii="Consolas" w:cs="Consolas" w:eastAsia="Consolas" w:hAnsi="Consolas"/>
-          <w:sz w:val="18"/>
-          <w:szCs w:val="18"/>
-        </w:rPr>
-        <w:t xml:space="preserve">SCORED_DATETIME</w:t>
-      </w:r>
-      <w:r>
-        <w:t xml:space="preserve"> is AEST, UTC or server-local.</w:t>
-      </w:r>
-    </w:p>
-    <w:p>
-      <w:pPr>
-        <w:pStyle w:val="ListParagraph"/>
-        <w:numPr>
-          <w:ilvl w:val="0"/>
-          <w:numId w:val="2"/>
-        </w:numPr>
-        <w:spacing w:after="80"/>
-      </w:pPr>
-      <w:r>
-        <w:t xml:space="preserve">When AM2117/AM2120/AM2123 are populated, and what </w:t>
-      </w:r>
-      <w:r>
-        <w:rPr>
-          <w:rFonts w:ascii="Consolas" w:cs="Consolas" w:eastAsia="Consolas" w:hAnsi="Consolas"/>
-          <w:sz w:val="18"/>
-          <w:szCs w:val="18"/>
-        </w:rPr>
-        <w:t xml:space="preserve">credit_deposit</w:t>
-      </w:r>
-      <w:r>
-        <w:t xml:space="preserve"> holds.</w:t>
-      </w:r>
+        <w:spacing w:after="120"/>
+      </w:pPr>
     </w:p>
     <w:sectPr>
       <w:footerReference w:type="default" r:id="rId6"/>

</xml_diff>

<commit_message>
Drop the active-provider-lists question for TaleFin
Co-Authored-By: Claude Opus 5.5 <noreply@anthropic.com>
Claude-Session: https://claude.ai/code/session_01BQuG2bu4esL5kQobzopCwY
</commit_message>
<xml_diff>
--- a/docs/Tippla_TaleFin_Response_Review.docx
+++ b/docs/Tippla_TaleFin_Response_Review.docx
@@ -6417,7 +6417,7 @@
                 <w:sz w:val="18"/>
                 <w:szCs w:val="18"/>
               </w:rPr>
-              <w:t xml:space="preserve">Open, low priority</w:t>
+              <w:t xml:space="preserve">Dropped (30/09)</w:t>
             </w:r>
           </w:p>
         </w:tc>
@@ -6443,7 +6443,7 @@
                 <w:sz w:val="18"/>
                 <w:szCs w:val="18"/>
               </w:rPr>
-              <w:t xml:space="preserve">Lender names already come from the other lists; this only confirms an assumption</w:t>
+              <w:t xml:space="preserve">Not needed: lender names come from the other lists and per-lender figures from transactions. The build doesn't read these three lists</w:t>
             </w:r>
           </w:p>
         </w:tc>

</xml_diff>